<commit_message>
Add selectable letter map scales and report.png markers.
Allow 1:1000–1:10000 situational maps with a roadwork report marker, use the same icon on the CRM map, collapse link/station sections in the task editor, and exclude graphify artifacts from rsync deploy.

Co-authored-by: Cursor <cursoragent@cursor.com>
</commit_message>
<xml_diff>
--- a/backend/app/letters/templates/oati_letter.docx
+++ b/backend/app/letters/templates/oati_letter.docx
@@ -393,16 +393,11 @@
               <w:ind w:left="176" w:firstLine="0"/>
             </w:pPr>
             <w:r>
-              <w:rPr>
-                <w:b w:val="1"/>
-                <w:bCs w:val="1"/>
-                <w:sz w:val="24"/>
-                <w:szCs w:val="24"/>
-                <w:shd w:val="nil" w:color="auto" w:fill="auto"/>
-                <w:rtl w:val="0"/>
-                <w:lang w:val="ru-RU"/>
-              </w:rPr>
               <w:t>О предоставлении информации</w:t>
+              <w:br/>
+            </w:r>
+            <w:r>
+              <w:t>об инциденте {Улица на которой находится объект reports} от {Актуальное сегодняшнее число} №{fid из новой таблицы писем}</w:t>
             </w:r>
           </w:p>
         </w:tc>

</xml_diff>

<commit_message>
Name OATI letter downloads by street, date, and number.
Use «Об инциденте {street} от {date} №{fid}.docx» for downloads, clean empty tables from the DOCX template, and cover both with tests.

Co-authored-by: Cursor <cursoragent@cursor.com>
</commit_message>
<xml_diff>
--- a/backend/app/letters/templates/oati_letter.docx
+++ b/backend/app/letters/templates/oati_letter.docx
@@ -425,143 +425,6 @@
         </w:rPr>
       </w:pPr>
     </w:p>
-    <w:tbl>
-      <w:tblPr>
-        <w:tblW w:w="10490" w:type="dxa"/>
-        <w:jc w:val="left"/>
-        <w:tblInd w:w="108" w:type="dxa"/>
-        <w:tblBorders>
-          <w:top w:val="single" w:color="ffffff" w:sz="8" w:space="0" w:shadow="0" w:frame="0"/>
-          <w:left w:val="single" w:color="ffffff" w:sz="8" w:space="0" w:shadow="0" w:frame="0"/>
-          <w:bottom w:val="single" w:color="ffffff" w:sz="8" w:space="0" w:shadow="0" w:frame="0"/>
-          <w:right w:val="single" w:color="ffffff" w:sz="8" w:space="0" w:shadow="0" w:frame="0"/>
-          <w:insideH w:val="single" w:color="ffffff" w:sz="8" w:space="0" w:shadow="0" w:frame="0"/>
-          <w:insideV w:val="single" w:color="ffffff" w:sz="8" w:space="0" w:shadow="0" w:frame="0"/>
-        </w:tblBorders>
-        <w:shd w:val="clear" w:color="auto" w:fill="d0ddef"/>
-        <w:tblLayout w:type="fixed"/>
-      </w:tblPr>
-      <w:tblGrid>
-        <w:gridCol w:w="10490"/>
-      </w:tblGrid>
-      <w:tr>
-        <w:tblPrEx>
-          <w:shd w:val="clear" w:color="auto" w:fill="d0ddef"/>
-        </w:tblPrEx>
-        <w:trPr>
-          <w:trHeight w:val="1310" w:hRule="atLeast"/>
-        </w:trPr>
-        <w:tc>
-          <w:tcPr>
-            <w:tcW w:type="dxa" w:w="10490"/>
-            <w:tcBorders>
-              <w:top w:val="nil"/>
-              <w:left w:val="nil"/>
-              <w:bottom w:val="nil"/>
-              <w:right w:val="nil"/>
-            </w:tcBorders>
-            <w:shd w:val="clear" w:color="auto" w:fill="auto"/>
-            <w:tcMar>
-              <w:top w:type="dxa" w:w="80"/>
-              <w:left w:type="dxa" w:w="256"/>
-              <w:bottom w:type="dxa" w:w="80"/>
-              <w:right w:type="dxa" w:w="80"/>
-            </w:tcMar>
-            <w:vAlign w:val="top"/>
-          </w:tcPr>
-          <w:p>
-            <w:pPr>
-              <w:pStyle w:val="Normal.0"/>
-              <w:ind w:left="176" w:firstLine="0"/>
-              <w:rPr>
-                <w:sz w:val="2"/>
-                <w:szCs w:val="2"/>
-                <w:shd w:val="nil" w:color="auto" w:fill="auto"/>
-              </w:rPr>
-            </w:pPr>
-            <w:r>
-              <w:rPr>
-                <w:sz w:val="2"/>
-                <w:szCs w:val="2"/>
-                <w:shd w:val="nil" w:color="auto" w:fill="auto"/>
-                <w:rtl w:val="0"/>
-                <w:lang w:val="ru-RU"/>
-              </w:rPr>
-              <w:t xml:space="preserve"> </w:t>
-            </w:r>
-          </w:p>
-          <w:p>
-            <w:pPr>
-              <w:pStyle w:val="Normal.0"/>
-              <w:ind w:left="63" w:firstLine="0"/>
-              <w:rPr>
-                <w:b w:val="1"/>
-                <w:bCs w:val="1"/>
-                <w:sz w:val="2"/>
-                <w:szCs w:val="2"/>
-                <w:shd w:val="nil" w:color="auto" w:fill="auto"/>
-                <w:lang w:val="ru-RU"/>
-              </w:rPr>
-            </w:pPr>
-          </w:p>
-          <w:p>
-            <w:pPr>
-              <w:pStyle w:val="Normal.0"/>
-              <w:rPr>
-                <w:sz w:val="2"/>
-                <w:szCs w:val="2"/>
-                <w:shd w:val="nil" w:color="auto" w:fill="auto"/>
-                <w:lang w:val="ru-RU"/>
-              </w:rPr>
-            </w:pPr>
-          </w:p>
-          <w:p>
-            <w:pPr>
-              <w:pStyle w:val="Тип документа"/>
-              <w:spacing w:before="0" w:after="120" w:line="288" w:lineRule="auto"/>
-              <w:jc w:val="left"/>
-              <w:rPr>
-                <w:sz w:val="26"/>
-                <w:szCs w:val="26"/>
-                <w:shd w:val="nil" w:color="auto" w:fill="auto"/>
-                <w:lang w:val="ru-RU"/>
-              </w:rPr>
-            </w:pPr>
-          </w:p>
-          <w:p>
-            <w:pPr>
-              <w:pStyle w:val="Normal.0"/>
-              <w:jc w:val="center"/>
-              <w:rPr>
-                <w:b w:val="1"/>
-                <w:bCs w:val="1"/>
-                <w:sz w:val="28"/>
-                <w:szCs w:val="28"/>
-                <w:shd w:val="nil" w:color="auto" w:fill="auto"/>
-                <w:lang w:val="ru-RU"/>
-              </w:rPr>
-            </w:pPr>
-          </w:p>
-          <w:p>
-            <w:pPr>
-              <w:pStyle w:val="Normal.0"/>
-              <w:ind w:left="205" w:firstLine="0"/>
-              <w:jc w:val="center"/>
-            </w:pPr>
-            <w:r>
-              <w:rPr>
-                <w:b w:val="1"/>
-                <w:bCs w:val="1"/>
-                <w:sz w:val="10"/>
-                <w:szCs w:val="10"/>
-                <w:shd w:val="nil" w:color="auto" w:fill="auto"/>
-                <w:lang w:val="ru-RU"/>
-              </w:rPr>
-            </w:r>
-          </w:p>
-        </w:tc>
-      </w:tr>
-    </w:tbl>
     <w:p>
       <w:pPr>
         <w:pStyle w:val="Normal.0"/>

</xml_diff>

<commit_message>
Refine OATI letter form with customer and violation checklist.
Add заказчик from source attributes, multi-select illegal-reason options, engineering absent/undefined modes, and update DOCX body formatting for producers, dates, and photo captions.

Co-authored-by: Cursor <cursoragent@cursor.com>
</commit_message>
<xml_diff>
--- a/backend/app/letters/templates/oati_letter.docx
+++ b/backend/app/letters/templates/oati_letter.docx
@@ -276,6 +276,9 @@
                 <w:lang w:val="ru-RU"/>
               </w:rPr>
             </w:pPr>
+            <w:r>
+              <w:t>ОАТИ города Москвы</w:t>
+            </w:r>
           </w:p>
           <w:p>
             <w:pPr>
@@ -310,16 +313,6 @@
               <w:pStyle w:val="Normal.0"/>
               <w:ind w:left="34" w:right="580" w:firstLine="0"/>
             </w:pPr>
-            <w:r>
-              <w:rPr>
-                <w:b w:val="1"/>
-                <w:bCs w:val="1"/>
-                <w:sz w:val="23"/>
-                <w:szCs w:val="23"/>
-                <w:shd w:val="nil" w:color="auto" w:fill="auto"/>
-                <w:lang w:val="ru-RU"/>
-              </w:rPr>
-            </w:r>
           </w:p>
         </w:tc>
       </w:tr>
@@ -464,26 +457,7 @@
         </w:rPr>
       </w:pPr>
       <w:r>
-        <w:rPr>
-          <w:sz w:val="28"/>
-          <w:szCs w:val="28"/>
-          <w:rtl w:val="0"/>
-          <w:lang w:val="ru-RU"/>
-        </w:rPr>
-        <w:t xml:space="preserve">ГБУ «Мосгоргеотрест» в рамках работы по «Созданию базы данных </w:t>
-        <w:br w:type="textWrapping"/>
-        <w:t xml:space="preserve">о проведении наблюдений за инженерной инфраструктурой города для дальнейшего использования при формировании Сводного плана наземных и подземных коммуникаций и подземных сооружений в городе Москве» выявлен инцидент </w:t>
-        <w:br w:type="textWrapping"/>
-        <w:t>с признаками незаконных земляных работ по строительству инженерной инфраструктуры</w:t>
-      </w:r>
-      <w:r>
-        <w:rPr>
-          <w:sz w:val="28"/>
-          <w:szCs w:val="28"/>
-          <w:rtl w:val="0"/>
-          <w:lang w:val="ru-RU"/>
-        </w:rPr>
-        <w:t>.</w:t>
+        <w:t>ГБУ «Мосгоргеотрест» в рамках работы по «Созданию базы данных о проведении наблюдений за инженерной инфраструктурой города для дальнейшего использования при формировании Сводного плана наземных и подземных коммуникаций и подземных сооружений в городе Москве» выявлен инцидент с признаками незаконности земляных работ при строительстве инженерных коммуникаций.</w:t>
       </w:r>
     </w:p>
     <w:p>
@@ -497,332 +471,11 @@
         </w:rPr>
       </w:pPr>
       <w:r>
-        <w:rPr>
-          <w:sz w:val="28"/>
-          <w:szCs w:val="28"/>
-          <w:rtl w:val="0"/>
-          <w:lang w:val="ru-RU"/>
-        </w:rPr>
-        <w:t xml:space="preserve">Отчёт об инциденте </w:t>
-      </w:r>
-      <w:r>
-        <w:rPr>
-          <w:b w:val="1"/>
-          <w:bCs w:val="1"/>
-          <w:sz w:val="24"/>
-          <w:szCs w:val="24"/>
-          <w:shd w:val="clear" w:color="auto" w:fill="ffff00"/>
-          <w:rtl w:val="0"/>
-          <w:lang w:val="en-US"/>
-        </w:rPr>
-        <w:t>{</w:t>
-      </w:r>
-      <w:r>
-        <w:rPr>
-          <w:b w:val="1"/>
-          <w:bCs w:val="1"/>
-          <w:sz w:val="24"/>
-          <w:szCs w:val="24"/>
-          <w:shd w:val="clear" w:color="auto" w:fill="ffff00"/>
-          <w:rtl w:val="0"/>
-          <w:lang w:val="en-US"/>
-        </w:rPr>
-        <w:t>Улица</w:t>
-      </w:r>
-      <w:r>
-        <w:rPr>
-          <w:b w:val="1"/>
-          <w:bCs w:val="1"/>
-          <w:sz w:val="24"/>
-          <w:szCs w:val="24"/>
-          <w:shd w:val="clear" w:color="auto" w:fill="ffff00"/>
-          <w:rtl w:val="0"/>
-          <w:lang w:val="ru-RU"/>
-        </w:rPr>
-        <w:t xml:space="preserve"> </w:t>
-      </w:r>
-      <w:r>
-        <w:rPr>
-          <w:b w:val="1"/>
-          <w:bCs w:val="1"/>
-          <w:sz w:val="24"/>
-          <w:szCs w:val="24"/>
-          <w:shd w:val="clear" w:color="auto" w:fill="ffff00"/>
-          <w:rtl w:val="0"/>
-          <w:lang w:val="ru-RU"/>
-        </w:rPr>
-        <w:t>на</w:t>
-      </w:r>
-      <w:r>
-        <w:rPr>
-          <w:b w:val="1"/>
-          <w:bCs w:val="1"/>
-          <w:sz w:val="24"/>
-          <w:szCs w:val="24"/>
-          <w:shd w:val="clear" w:color="auto" w:fill="ffff00"/>
-          <w:rtl w:val="0"/>
-          <w:lang w:val="ru-RU"/>
-        </w:rPr>
-        <w:t xml:space="preserve"> которо</w:t>
-      </w:r>
-      <w:r>
-        <w:rPr>
-          <w:b w:val="1"/>
-          <w:bCs w:val="1"/>
-          <w:sz w:val="24"/>
-          <w:szCs w:val="24"/>
-          <w:shd w:val="clear" w:color="auto" w:fill="ffff00"/>
-          <w:rtl w:val="0"/>
-          <w:lang w:val="ru-RU"/>
-        </w:rPr>
-        <w:t>й</w:t>
-      </w:r>
-      <w:r>
-        <w:rPr>
-          <w:b w:val="1"/>
-          <w:bCs w:val="1"/>
-          <w:sz w:val="24"/>
-          <w:szCs w:val="24"/>
-          <w:shd w:val="clear" w:color="auto" w:fill="ffff00"/>
-          <w:rtl w:val="0"/>
-          <w:lang w:val="ru-RU"/>
-        </w:rPr>
-        <w:t xml:space="preserve"> находится объект </w:t>
-      </w:r>
-      <w:r>
-        <w:rPr>
-          <w:b w:val="1"/>
-          <w:bCs w:val="1"/>
-          <w:sz w:val="24"/>
-          <w:szCs w:val="24"/>
-          <w:shd w:val="clear" w:color="auto" w:fill="ffff00"/>
-          <w:rtl w:val="0"/>
-          <w:lang w:val="en-US"/>
-        </w:rPr>
-        <w:t>reports}</w:t>
-      </w:r>
-      <w:r>
-        <w:rPr>
-          <w:sz w:val="28"/>
-          <w:szCs w:val="28"/>
-          <w:rtl w:val="0"/>
-          <w:lang w:val="ru-RU"/>
-        </w:rPr>
-        <w:t xml:space="preserve"> </w:t>
-      </w:r>
-      <w:r>
-        <w:rPr>
-          <w:b w:val="1"/>
-          <w:bCs w:val="1"/>
-          <w:sz w:val="24"/>
-          <w:szCs w:val="24"/>
-          <w:rtl w:val="0"/>
-          <w:lang w:val="ru-RU"/>
-        </w:rPr>
-        <w:t xml:space="preserve">от </w:t>
-      </w:r>
-      <w:r>
-        <w:rPr>
-          <w:b w:val="1"/>
-          <w:bCs w:val="1"/>
-          <w:sz w:val="24"/>
-          <w:szCs w:val="24"/>
-          <w:shd w:val="clear" w:color="auto" w:fill="ffff00"/>
-          <w:rtl w:val="0"/>
-          <w:lang w:val="en-US"/>
-        </w:rPr>
-        <w:t>{</w:t>
-      </w:r>
-      <w:r>
-        <w:rPr>
-          <w:b w:val="1"/>
-          <w:bCs w:val="1"/>
-          <w:sz w:val="24"/>
-          <w:szCs w:val="24"/>
-          <w:shd w:val="clear" w:color="auto" w:fill="ffff00"/>
-          <w:rtl w:val="0"/>
-          <w:lang w:val="ru-RU"/>
-        </w:rPr>
-        <w:t>Актуальное сегодняшнее число</w:t>
-      </w:r>
-      <w:r>
-        <w:rPr>
-          <w:b w:val="1"/>
-          <w:bCs w:val="1"/>
-          <w:sz w:val="24"/>
-          <w:szCs w:val="24"/>
-          <w:shd w:val="clear" w:color="auto" w:fill="ffff00"/>
-          <w:rtl w:val="0"/>
-          <w:lang w:val="en-US"/>
-        </w:rPr>
-        <w:t>}</w:t>
-      </w:r>
-      <w:r>
-        <w:rPr>
-          <w:b w:val="1"/>
-          <w:bCs w:val="1"/>
-          <w:sz w:val="24"/>
-          <w:szCs w:val="24"/>
-          <w:rtl w:val="0"/>
-          <w:lang w:val="ru-RU"/>
-        </w:rPr>
-        <w:t xml:space="preserve"> №</w:t>
-      </w:r>
-      <w:r>
-        <w:rPr>
-          <w:b w:val="1"/>
-          <w:bCs w:val="1"/>
-          <w:sz w:val="24"/>
-          <w:szCs w:val="24"/>
-          <w:shd w:val="clear" w:color="auto" w:fill="ffff00"/>
-          <w:rtl w:val="0"/>
-          <w:lang w:val="en-US"/>
-        </w:rPr>
-        <w:t xml:space="preserve">{fid </w:t>
-      </w:r>
-      <w:r>
-        <w:rPr>
-          <w:b w:val="1"/>
-          <w:bCs w:val="1"/>
-          <w:sz w:val="24"/>
-          <w:szCs w:val="24"/>
-          <w:shd w:val="clear" w:color="auto" w:fill="ffff00"/>
-          <w:rtl w:val="0"/>
-          <w:lang w:val="ru-RU"/>
-        </w:rPr>
-        <w:t>из новой таблицы писем</w:t>
-      </w:r>
-      <w:r>
-        <w:rPr>
-          <w:b w:val="1"/>
-          <w:bCs w:val="1"/>
-          <w:sz w:val="24"/>
-          <w:szCs w:val="24"/>
-          <w:shd w:val="clear" w:color="auto" w:fill="ffff00"/>
-          <w:rtl w:val="0"/>
-          <w:lang w:val="en-US"/>
-        </w:rPr>
-        <w:t xml:space="preserve">} </w:t>
-      </w:r>
-      <w:r>
-        <w:rPr>
-          <w:b w:val="1"/>
-          <w:bCs w:val="1"/>
-          <w:sz w:val="24"/>
-          <w:szCs w:val="24"/>
-          <w:shd w:val="clear" w:color="auto" w:fill="ffff00"/>
-          <w:rtl w:val="0"/>
-          <w:lang w:val="en-US"/>
-        </w:rPr>
-        <w:t>:</w:t>
-      </w:r>
-      <w:r>
-        <w:rPr>
-          <w:b w:val="1"/>
-          <w:bCs w:val="1"/>
-          <w:sz w:val="24"/>
-          <w:szCs w:val="24"/>
-          <w:shd w:val="clear" w:color="auto" w:fill="ffff00"/>
-          <w:lang w:val="en-US"/>
-        </w:rPr>
-        <w:br w:type="textWrapping"/>
-      </w:r>
-      <w:r>
-        <w:rPr>
-          <w:sz w:val="28"/>
-          <w:szCs w:val="28"/>
-          <w:rtl w:val="0"/>
-          <w:lang w:val="ru-RU"/>
-        </w:rPr>
-        <w:t xml:space="preserve">1. </w:t>
-      </w:r>
-      <w:r>
-        <w:rPr>
-          <w:sz w:val="28"/>
-          <w:szCs w:val="28"/>
-          <w:rtl w:val="0"/>
-          <w:lang w:val="ru-RU"/>
-        </w:rPr>
-        <w:t>Сведения о производителе работ</w:t>
-      </w:r>
-      <w:r>
-        <w:rPr>
-          <w:sz w:val="28"/>
-          <w:szCs w:val="28"/>
-          <w:rtl w:val="0"/>
-          <w:lang w:val="ru-RU"/>
-        </w:rPr>
-        <w:t xml:space="preserve">: </w:t>
-      </w:r>
-      <w:r>
-        <w:rPr>
-          <w:b w:val="1"/>
-          <w:bCs w:val="1"/>
-          <w:sz w:val="24"/>
-          <w:szCs w:val="24"/>
-          <w:shd w:val="clear" w:color="auto" w:fill="ffff00"/>
-          <w:rtl w:val="0"/>
-          <w:lang w:val="en-US"/>
-        </w:rPr>
-        <w:t>{</w:t>
-      </w:r>
-      <w:r>
-        <w:rPr>
-          <w:b w:val="1"/>
-          <w:bCs w:val="1"/>
-          <w:sz w:val="24"/>
-          <w:szCs w:val="24"/>
-          <w:shd w:val="clear" w:color="auto" w:fill="ffff00"/>
-          <w:rtl w:val="0"/>
-          <w:lang w:val="ru-RU"/>
-        </w:rPr>
-        <w:t>Получаем из столбаца «Исполнитель»</w:t>
-      </w:r>
-      <w:r>
-        <w:rPr>
-          <w:b w:val="1"/>
-          <w:bCs w:val="1"/>
-          <w:sz w:val="24"/>
-          <w:szCs w:val="24"/>
-          <w:shd w:val="clear" w:color="auto" w:fill="ffff00"/>
-          <w:rtl w:val="0"/>
-          <w:lang w:val="ru-RU"/>
-        </w:rPr>
-        <w:t xml:space="preserve">, </w:t>
-      </w:r>
-      <w:r>
-        <w:rPr>
-          <w:b w:val="1"/>
-          <w:bCs w:val="1"/>
-          <w:sz w:val="24"/>
-          <w:szCs w:val="24"/>
-          <w:shd w:val="clear" w:color="auto" w:fill="ffff00"/>
-          <w:rtl w:val="0"/>
-          <w:lang w:val="ru-RU"/>
-        </w:rPr>
-        <w:t>если работаем с задачей где этого нет можем ввести вручную или оставить пустым</w:t>
-      </w:r>
-      <w:r>
-        <w:rPr>
-          <w:b w:val="1"/>
-          <w:bCs w:val="1"/>
-          <w:sz w:val="24"/>
-          <w:szCs w:val="24"/>
-          <w:u w:val="single"/>
-          <w:shd w:val="clear" w:color="auto" w:fill="ffff00"/>
-          <w:rtl w:val="0"/>
-          <w:lang w:val="en-US"/>
-        </w:rPr>
-        <w:t>}</w:t>
-      </w:r>
-      <w:r>
-        <w:rPr>
-          <w:sz w:val="28"/>
-          <w:szCs w:val="28"/>
-          <w:rtl w:val="0"/>
-          <w:lang w:val="ru-RU"/>
-        </w:rPr>
-        <w:t>;</w:t>
+        <w:t>Отчёт об инциденте {Улица на которой находится объект reports} от {Актуальное сегодняшнее число} №{fid из новой таблицы писем} :</w:t>
+        <w:br/>
+      </w:r>
+      <w:r>
+        <w:t>1. Сведения о производителе работ: {Получаем из столбаца «Исполнитель», если работаем с задачей где этого нет можем ввести вручную или оставить пустым};</w:t>
       </w:r>
     </w:p>
     <w:p>
@@ -1318,290 +971,15 @@
         <w:jc w:val="both"/>
       </w:pPr>
       <w:r>
-        <w:rPr>
-          <w:sz w:val="28"/>
-          <w:szCs w:val="28"/>
-          <w:rtl w:val="0"/>
-          <w:lang w:val="ru-RU"/>
-        </w:rPr>
-        <w:t xml:space="preserve">6. </w:t>
-      </w:r>
-      <w:r>
-        <w:rPr>
-          <w:sz w:val="28"/>
-          <w:szCs w:val="28"/>
-          <w:rtl w:val="0"/>
-          <w:lang w:val="ru-RU"/>
-        </w:rPr>
-        <w:t>Описание данных</w:t>
-      </w:r>
-      <w:r>
-        <w:rPr>
-          <w:sz w:val="28"/>
-          <w:szCs w:val="28"/>
-          <w:rtl w:val="0"/>
-          <w:lang w:val="ru-RU"/>
-        </w:rPr>
-        <w:t xml:space="preserve">: </w:t>
-      </w:r>
-      <w:r>
-        <w:rPr>
-          <w:sz w:val="24"/>
-          <w:szCs w:val="24"/>
-          <w:rtl w:val="0"/>
-          <w:lang w:val="en-US"/>
-        </w:rPr>
-        <w:t>{</w:t>
-      </w:r>
-      <w:r>
-        <w:rPr>
-          <w:sz w:val="24"/>
-          <w:szCs w:val="24"/>
-          <w:rtl w:val="0"/>
-          <w:lang w:val="ru-RU"/>
-        </w:rPr>
-        <w:t>Ввод комментария вручную</w:t>
-      </w:r>
-      <w:r>
-        <w:rPr>
-          <w:sz w:val="24"/>
-          <w:szCs w:val="24"/>
-          <w:rtl w:val="0"/>
-          <w:lang w:val="en-US"/>
-        </w:rPr>
-        <w:t xml:space="preserve">} </w:t>
-      </w:r>
-      <w:r>
-        <w:rPr>
-          <w:sz w:val="24"/>
-          <w:szCs w:val="24"/>
-          <w:lang w:val="en-US"/>
-        </w:rPr>
-        <w:br w:type="textWrapping"/>
-      </w:r>
-      <w:r>
-        <w:rPr>
-          <w:sz w:val="28"/>
-          <w:szCs w:val="28"/>
-          <w:rtl w:val="0"/>
-          <w:lang w:val="ru-RU"/>
-        </w:rPr>
-        <w:t xml:space="preserve">7. </w:t>
-      </w:r>
-      <w:r>
-        <w:rPr>
-          <w:sz w:val="28"/>
-          <w:szCs w:val="28"/>
-          <w:rtl w:val="0"/>
-          <w:lang w:val="ru-RU"/>
-        </w:rPr>
-        <w:t>Данные</w:t>
-      </w:r>
-      <w:r>
-        <w:rPr>
-          <w:sz w:val="28"/>
-          <w:szCs w:val="28"/>
-          <w:rtl w:val="0"/>
-          <w:lang w:val="ru-RU"/>
-        </w:rPr>
-        <w:t xml:space="preserve">, </w:t>
-      </w:r>
-      <w:r>
-        <w:rPr>
-          <w:sz w:val="28"/>
-          <w:szCs w:val="28"/>
-          <w:rtl w:val="0"/>
-          <w:lang w:val="ru-RU"/>
-        </w:rPr>
-        <w:t>указывающие на признаки наличия события административного правонарушения</w:t>
-      </w:r>
-      <w:r>
-        <w:rPr>
-          <w:sz w:val="28"/>
-          <w:szCs w:val="28"/>
-          <w:rtl w:val="0"/>
-          <w:lang w:val="ru-RU"/>
-        </w:rPr>
-        <w:t xml:space="preserve">: </w:t>
-      </w:r>
-      <w:r>
-        <w:rPr>
-          <w:sz w:val="24"/>
-          <w:szCs w:val="24"/>
-          <w:rtl w:val="0"/>
-          <w:lang w:val="en-US"/>
-        </w:rPr>
-        <w:t>{</w:t>
-      </w:r>
-      <w:r>
-        <w:rPr>
-          <w:sz w:val="24"/>
-          <w:szCs w:val="24"/>
-          <w:rtl w:val="0"/>
-          <w:lang w:val="ru-RU"/>
-        </w:rPr>
-        <w:t>Ввод комментария вручную</w:t>
-      </w:r>
-      <w:r>
-        <w:rPr>
-          <w:sz w:val="24"/>
-          <w:szCs w:val="24"/>
-          <w:rtl w:val="0"/>
-          <w:lang w:val="ru-RU"/>
-        </w:rPr>
-        <w:t xml:space="preserve">, </w:t>
-      </w:r>
-      <w:r>
-        <w:rPr>
-          <w:sz w:val="24"/>
-          <w:szCs w:val="24"/>
-          <w:rtl w:val="0"/>
-          <w:lang w:val="ru-RU"/>
-        </w:rPr>
-        <w:t xml:space="preserve">по умолчанию заполнено </w:t>
-      </w:r>
-      <w:r>
-        <w:rPr>
-          <w:sz w:val="24"/>
-          <w:szCs w:val="24"/>
-          <w:rtl w:val="0"/>
-          <w:lang w:val="ru-RU"/>
-        </w:rPr>
-        <w:t xml:space="preserve">: </w:t>
-      </w:r>
-      <w:r>
-        <w:rPr>
-          <w:sz w:val="28"/>
-          <w:szCs w:val="28"/>
-          <w:rtl w:val="0"/>
-          <w:lang w:val="ru-RU"/>
-        </w:rPr>
-        <w:t>нормативный правовой акт города Москвы</w:t>
-      </w:r>
-      <w:r>
-        <w:rPr>
-          <w:sz w:val="28"/>
-          <w:szCs w:val="28"/>
-          <w:rtl w:val="0"/>
-          <w:lang w:val="ru-RU"/>
-        </w:rPr>
-        <w:t xml:space="preserve">, </w:t>
-      </w:r>
-      <w:r>
-        <w:rPr>
-          <w:sz w:val="28"/>
-          <w:szCs w:val="28"/>
-          <w:rtl w:val="0"/>
-          <w:lang w:val="ru-RU"/>
-        </w:rPr>
-        <w:t xml:space="preserve">требования которого были нарушены </w:t>
-      </w:r>
-      <w:r>
-        <w:rPr>
-          <w:sz w:val="28"/>
-          <w:szCs w:val="28"/>
-          <w:rtl w:val="0"/>
-          <w:lang w:val="ru-RU"/>
-        </w:rPr>
-        <w:t xml:space="preserve">- </w:t>
-      </w:r>
-      <w:r>
-        <w:rPr>
-          <w:sz w:val="28"/>
-          <w:szCs w:val="28"/>
-          <w:rtl w:val="0"/>
-          <w:lang w:val="ru-RU"/>
-        </w:rPr>
-        <w:t xml:space="preserve">часть </w:t>
-      </w:r>
-      <w:r>
-        <w:rPr>
-          <w:sz w:val="28"/>
-          <w:szCs w:val="28"/>
-          <w:rtl w:val="0"/>
-          <w:lang w:val="ru-RU"/>
-        </w:rPr>
-        <w:t xml:space="preserve">5 </w:t>
-      </w:r>
-      <w:r>
-        <w:rPr>
-          <w:sz w:val="28"/>
-          <w:szCs w:val="28"/>
-          <w:rtl w:val="0"/>
-          <w:lang w:val="ru-RU"/>
-        </w:rPr>
-        <w:t xml:space="preserve">статьи </w:t>
-      </w:r>
-      <w:r>
-        <w:rPr>
-          <w:sz w:val="28"/>
-          <w:szCs w:val="28"/>
-          <w:rtl w:val="0"/>
-          <w:lang w:val="ru-RU"/>
-        </w:rPr>
-        <w:t xml:space="preserve">17 </w:t>
-      </w:r>
-      <w:r>
-        <w:rPr>
-          <w:sz w:val="28"/>
-          <w:szCs w:val="28"/>
-          <w:rtl w:val="0"/>
-          <w:lang w:val="ru-RU"/>
-        </w:rPr>
-        <w:t xml:space="preserve">Закона города Москвы от </w:t>
-      </w:r>
-      <w:r>
-        <w:rPr>
-          <w:sz w:val="28"/>
-          <w:szCs w:val="28"/>
-          <w:rtl w:val="0"/>
-          <w:lang w:val="ru-RU"/>
-        </w:rPr>
-        <w:t xml:space="preserve">30.04.2014 </w:t>
-      </w:r>
-      <w:r>
-        <w:rPr>
-          <w:sz w:val="28"/>
-          <w:szCs w:val="28"/>
-          <w:rtl w:val="0"/>
-          <w:lang w:val="ru-RU"/>
-        </w:rPr>
-        <w:t xml:space="preserve">№ </w:t>
-      </w:r>
-      <w:r>
-        <w:rPr>
-          <w:sz w:val="28"/>
-          <w:szCs w:val="28"/>
-          <w:rtl w:val="0"/>
-          <w:lang w:val="ru-RU"/>
-        </w:rPr>
-        <w:t xml:space="preserve">18 </w:t>
-      </w:r>
-      <w:r>
-        <w:rPr>
-          <w:sz w:val="28"/>
-          <w:szCs w:val="28"/>
-          <w:rtl w:val="0"/>
-        </w:rPr>
-        <w:br w:type="textWrapping"/>
-        <w:t>«О благоустройстве в городе Москве»</w:t>
-      </w:r>
-      <w:r>
-        <w:rPr>
-          <w:sz w:val="24"/>
-          <w:szCs w:val="24"/>
-          <w:rtl w:val="0"/>
-          <w:lang w:val="en-US"/>
-        </w:rPr>
-        <w:t>}</w:t>
-      </w:r>
-      <w:r>
-        <w:rPr>
-          <w:sz w:val="24"/>
-          <w:szCs w:val="24"/>
-          <w:lang w:val="en-US"/>
-        </w:rPr>
-        <w:br w:type="textWrapping"/>
+        <w:t>6. Описание характера работ: {Ввод комментария вручную}</w:t>
+        <w:br/>
+      </w:r>
+      <w:r>
+        <w:t>7. Признаки незаконности:</w:t>
+        <w:br/>
+      </w:r>
+      <w:r>
+        <w:t>{Признаки незаконности из справочника}</w:t>
       </w:r>
     </w:p>
     <w:p>
@@ -1699,76 +1077,7 @@
         </w:rPr>
       </w:pPr>
       <w:r>
-        <w:rPr>
-          <w:sz w:val="28"/>
-          <w:szCs w:val="28"/>
-          <w:rtl w:val="0"/>
-          <w:lang w:val="ru-RU"/>
-        </w:rPr>
-        <w:t xml:space="preserve">2. </w:t>
-      </w:r>
-      <w:r>
-        <w:rPr>
-          <w:sz w:val="28"/>
-          <w:szCs w:val="28"/>
-          <w:rtl w:val="0"/>
-          <w:lang w:val="ru-RU"/>
-        </w:rPr>
-        <w:t>Ф</w:t>
-      </w:r>
-      <w:r>
-        <w:rPr>
-          <w:sz w:val="28"/>
-          <w:szCs w:val="28"/>
-          <w:rtl w:val="0"/>
-          <w:lang w:val="ru-RU"/>
-        </w:rPr>
-        <w:t>отофи</w:t>
-      </w:r>
-      <w:r>
-        <w:rPr>
-          <w:sz w:val="28"/>
-          <w:szCs w:val="28"/>
-          <w:rtl w:val="0"/>
-          <w:lang w:val="ru-RU"/>
-        </w:rPr>
-        <w:t>кс</w:t>
-      </w:r>
-      <w:r>
-        <w:rPr>
-          <w:sz w:val="28"/>
-          <w:szCs w:val="28"/>
-          <w:rtl w:val="0"/>
-          <w:lang w:val="ru-RU"/>
-        </w:rPr>
-        <w:t>ация</w:t>
-      </w:r>
-      <w:r>
-        <w:rPr>
-          <w:sz w:val="28"/>
-          <w:szCs w:val="28"/>
-          <w:rtl w:val="0"/>
-          <w:lang w:val="ru-RU"/>
-        </w:rPr>
-        <w:t xml:space="preserve">: 1 </w:t>
-      </w:r>
-      <w:r>
-        <w:rPr>
-          <w:sz w:val="28"/>
-          <w:szCs w:val="28"/>
-          <w:rtl w:val="0"/>
-          <w:lang w:val="ru-RU"/>
-        </w:rPr>
-        <w:t>экз</w:t>
-      </w:r>
-      <w:r>
-        <w:rPr>
-          <w:sz w:val="28"/>
-          <w:szCs w:val="28"/>
-          <w:rtl w:val="0"/>
-          <w:lang w:val="ru-RU"/>
-        </w:rPr>
-        <w:t>.</w:t>
+        <w:t>2. Фотофиксация: {число выбранных фото} экз.</w:t>
       </w:r>
     </w:p>
     <w:p>

</xml_diff>